<commit_message>
Incersión de datos en tablas
</commit_message>
<xml_diff>
--- a/informe/Proyecto 2.docx
+++ b/informe/Proyecto 2.docx
@@ -456,13 +456,41 @@
           <w:szCs w:val="24"/>
         </w:rPr>
       </w:pPr>
-      <w:r>
-        <w:rPr>
-          <w:rFonts w:ascii="Times New Roman" w:hAnsi="Times New Roman" w:cs="Times New Roman"/>
-          <w:sz w:val="24"/>
-          <w:szCs w:val="24"/>
-        </w:rPr>
-        <w:t>Id_producto (pk)</w:t>
+      <w:proofErr w:type="spellStart"/>
+      <w:r>
+        <w:rPr>
+          <w:rFonts w:ascii="Times New Roman" w:hAnsi="Times New Roman" w:cs="Times New Roman"/>
+          <w:sz w:val="24"/>
+          <w:szCs w:val="24"/>
+        </w:rPr>
+        <w:t>Id_producto</w:t>
+      </w:r>
+      <w:proofErr w:type="spellEnd"/>
+      <w:r>
+        <w:rPr>
+          <w:rFonts w:ascii="Times New Roman" w:hAnsi="Times New Roman" w:cs="Times New Roman"/>
+          <w:sz w:val="24"/>
+          <w:szCs w:val="24"/>
+        </w:rPr>
+        <w:t xml:space="preserve"> (</w:t>
+      </w:r>
+      <w:proofErr w:type="spellStart"/>
+      <w:r>
+        <w:rPr>
+          <w:rFonts w:ascii="Times New Roman" w:hAnsi="Times New Roman" w:cs="Times New Roman"/>
+          <w:sz w:val="24"/>
+          <w:szCs w:val="24"/>
+        </w:rPr>
+        <w:t>pk</w:t>
+      </w:r>
+      <w:proofErr w:type="spellEnd"/>
+      <w:r>
+        <w:rPr>
+          <w:rFonts w:ascii="Times New Roman" w:hAnsi="Times New Roman" w:cs="Times New Roman"/>
+          <w:sz w:val="24"/>
+          <w:szCs w:val="24"/>
+        </w:rPr>
+        <w:t>)</w:t>
       </w:r>
     </w:p>
     <w:p>
@@ -548,13 +576,41 @@
           <w:szCs w:val="24"/>
         </w:rPr>
       </w:pPr>
-      <w:r>
-        <w:rPr>
-          <w:rFonts w:ascii="Times New Roman" w:hAnsi="Times New Roman" w:cs="Times New Roman"/>
-          <w:sz w:val="24"/>
-          <w:szCs w:val="24"/>
-        </w:rPr>
-        <w:t>Id_categoria (fk)</w:t>
+      <w:proofErr w:type="spellStart"/>
+      <w:r>
+        <w:rPr>
+          <w:rFonts w:ascii="Times New Roman" w:hAnsi="Times New Roman" w:cs="Times New Roman"/>
+          <w:sz w:val="24"/>
+          <w:szCs w:val="24"/>
+        </w:rPr>
+        <w:t>Id_categoria</w:t>
+      </w:r>
+      <w:proofErr w:type="spellEnd"/>
+      <w:r>
+        <w:rPr>
+          <w:rFonts w:ascii="Times New Roman" w:hAnsi="Times New Roman" w:cs="Times New Roman"/>
+          <w:sz w:val="24"/>
+          <w:szCs w:val="24"/>
+        </w:rPr>
+        <w:t xml:space="preserve"> (</w:t>
+      </w:r>
+      <w:proofErr w:type="spellStart"/>
+      <w:r>
+        <w:rPr>
+          <w:rFonts w:ascii="Times New Roman" w:hAnsi="Times New Roman" w:cs="Times New Roman"/>
+          <w:sz w:val="24"/>
+          <w:szCs w:val="24"/>
+        </w:rPr>
+        <w:t>fk</w:t>
+      </w:r>
+      <w:proofErr w:type="spellEnd"/>
+      <w:r>
+        <w:rPr>
+          <w:rFonts w:ascii="Times New Roman" w:hAnsi="Times New Roman" w:cs="Times New Roman"/>
+          <w:sz w:val="24"/>
+          <w:szCs w:val="24"/>
+        </w:rPr>
+        <w:t>)</w:t>
       </w:r>
     </w:p>
     <w:p>
@@ -571,13 +627,41 @@
           <w:szCs w:val="24"/>
         </w:rPr>
       </w:pPr>
-      <w:r>
-        <w:rPr>
-          <w:rFonts w:ascii="Times New Roman" w:hAnsi="Times New Roman" w:cs="Times New Roman"/>
-          <w:sz w:val="24"/>
-          <w:szCs w:val="24"/>
-        </w:rPr>
-        <w:t>Id_proveedor (fk)</w:t>
+      <w:proofErr w:type="spellStart"/>
+      <w:r>
+        <w:rPr>
+          <w:rFonts w:ascii="Times New Roman" w:hAnsi="Times New Roman" w:cs="Times New Roman"/>
+          <w:sz w:val="24"/>
+          <w:szCs w:val="24"/>
+        </w:rPr>
+        <w:t>Id_proveedor</w:t>
+      </w:r>
+      <w:proofErr w:type="spellEnd"/>
+      <w:r>
+        <w:rPr>
+          <w:rFonts w:ascii="Times New Roman" w:hAnsi="Times New Roman" w:cs="Times New Roman"/>
+          <w:sz w:val="24"/>
+          <w:szCs w:val="24"/>
+        </w:rPr>
+        <w:t xml:space="preserve"> (</w:t>
+      </w:r>
+      <w:proofErr w:type="spellStart"/>
+      <w:r>
+        <w:rPr>
+          <w:rFonts w:ascii="Times New Roman" w:hAnsi="Times New Roman" w:cs="Times New Roman"/>
+          <w:sz w:val="24"/>
+          <w:szCs w:val="24"/>
+        </w:rPr>
+        <w:t>fk</w:t>
+      </w:r>
+      <w:proofErr w:type="spellEnd"/>
+      <w:r>
+        <w:rPr>
+          <w:rFonts w:ascii="Times New Roman" w:hAnsi="Times New Roman" w:cs="Times New Roman"/>
+          <w:sz w:val="24"/>
+          <w:szCs w:val="24"/>
+        </w:rPr>
+        <w:t>)</w:t>
       </w:r>
     </w:p>
     <w:p>
@@ -660,13 +744,41 @@
           <w:szCs w:val="24"/>
         </w:rPr>
       </w:pPr>
-      <w:r>
-        <w:rPr>
-          <w:rFonts w:ascii="Times New Roman" w:hAnsi="Times New Roman" w:cs="Times New Roman"/>
-          <w:sz w:val="24"/>
-          <w:szCs w:val="24"/>
-        </w:rPr>
-        <w:t>Id_cateoría (pk)</w:t>
+      <w:proofErr w:type="spellStart"/>
+      <w:r>
+        <w:rPr>
+          <w:rFonts w:ascii="Times New Roman" w:hAnsi="Times New Roman" w:cs="Times New Roman"/>
+          <w:sz w:val="24"/>
+          <w:szCs w:val="24"/>
+        </w:rPr>
+        <w:t>Id_cateoría</w:t>
+      </w:r>
+      <w:proofErr w:type="spellEnd"/>
+      <w:r>
+        <w:rPr>
+          <w:rFonts w:ascii="Times New Roman" w:hAnsi="Times New Roman" w:cs="Times New Roman"/>
+          <w:sz w:val="24"/>
+          <w:szCs w:val="24"/>
+        </w:rPr>
+        <w:t xml:space="preserve"> (</w:t>
+      </w:r>
+      <w:proofErr w:type="spellStart"/>
+      <w:r>
+        <w:rPr>
+          <w:rFonts w:ascii="Times New Roman" w:hAnsi="Times New Roman" w:cs="Times New Roman"/>
+          <w:sz w:val="24"/>
+          <w:szCs w:val="24"/>
+        </w:rPr>
+        <w:t>pk</w:t>
+      </w:r>
+      <w:proofErr w:type="spellEnd"/>
+      <w:r>
+        <w:rPr>
+          <w:rFonts w:ascii="Times New Roman" w:hAnsi="Times New Roman" w:cs="Times New Roman"/>
+          <w:sz w:val="24"/>
+          <w:szCs w:val="24"/>
+        </w:rPr>
+        <w:t>)</w:t>
       </w:r>
     </w:p>
     <w:p>
@@ -772,13 +884,41 @@
           <w:szCs w:val="24"/>
         </w:rPr>
       </w:pPr>
-      <w:r>
-        <w:rPr>
-          <w:rFonts w:ascii="Times New Roman" w:hAnsi="Times New Roman" w:cs="Times New Roman"/>
-          <w:sz w:val="24"/>
-          <w:szCs w:val="24"/>
-        </w:rPr>
-        <w:t>Id_proveedor (pk)</w:t>
+      <w:proofErr w:type="spellStart"/>
+      <w:r>
+        <w:rPr>
+          <w:rFonts w:ascii="Times New Roman" w:hAnsi="Times New Roman" w:cs="Times New Roman"/>
+          <w:sz w:val="24"/>
+          <w:szCs w:val="24"/>
+        </w:rPr>
+        <w:t>Id_proveedor</w:t>
+      </w:r>
+      <w:proofErr w:type="spellEnd"/>
+      <w:r>
+        <w:rPr>
+          <w:rFonts w:ascii="Times New Roman" w:hAnsi="Times New Roman" w:cs="Times New Roman"/>
+          <w:sz w:val="24"/>
+          <w:szCs w:val="24"/>
+        </w:rPr>
+        <w:t xml:space="preserve"> (</w:t>
+      </w:r>
+      <w:proofErr w:type="spellStart"/>
+      <w:r>
+        <w:rPr>
+          <w:rFonts w:ascii="Times New Roman" w:hAnsi="Times New Roman" w:cs="Times New Roman"/>
+          <w:sz w:val="24"/>
+          <w:szCs w:val="24"/>
+        </w:rPr>
+        <w:t>pk</w:t>
+      </w:r>
+      <w:proofErr w:type="spellEnd"/>
+      <w:r>
+        <w:rPr>
+          <w:rFonts w:ascii="Times New Roman" w:hAnsi="Times New Roman" w:cs="Times New Roman"/>
+          <w:sz w:val="24"/>
+          <w:szCs w:val="24"/>
+        </w:rPr>
+        <w:t>)</w:t>
       </w:r>
     </w:p>
     <w:p>
@@ -930,13 +1070,41 @@
           <w:szCs w:val="24"/>
         </w:rPr>
       </w:pPr>
-      <w:r>
-        <w:rPr>
-          <w:rFonts w:ascii="Times New Roman" w:hAnsi="Times New Roman" w:cs="Times New Roman"/>
-          <w:sz w:val="24"/>
-          <w:szCs w:val="24"/>
-        </w:rPr>
-        <w:t>Id_cliente (pk)</w:t>
+      <w:proofErr w:type="spellStart"/>
+      <w:r>
+        <w:rPr>
+          <w:rFonts w:ascii="Times New Roman" w:hAnsi="Times New Roman" w:cs="Times New Roman"/>
+          <w:sz w:val="24"/>
+          <w:szCs w:val="24"/>
+        </w:rPr>
+        <w:t>Id_cliente</w:t>
+      </w:r>
+      <w:proofErr w:type="spellEnd"/>
+      <w:r>
+        <w:rPr>
+          <w:rFonts w:ascii="Times New Roman" w:hAnsi="Times New Roman" w:cs="Times New Roman"/>
+          <w:sz w:val="24"/>
+          <w:szCs w:val="24"/>
+        </w:rPr>
+        <w:t xml:space="preserve"> (</w:t>
+      </w:r>
+      <w:proofErr w:type="spellStart"/>
+      <w:r>
+        <w:rPr>
+          <w:rFonts w:ascii="Times New Roman" w:hAnsi="Times New Roman" w:cs="Times New Roman"/>
+          <w:sz w:val="24"/>
+          <w:szCs w:val="24"/>
+        </w:rPr>
+        <w:t>pk</w:t>
+      </w:r>
+      <w:proofErr w:type="spellEnd"/>
+      <w:r>
+        <w:rPr>
+          <w:rFonts w:ascii="Times New Roman" w:hAnsi="Times New Roman" w:cs="Times New Roman"/>
+          <w:sz w:val="24"/>
+          <w:szCs w:val="24"/>
+        </w:rPr>
+        <w:t>)</w:t>
       </w:r>
     </w:p>
     <w:p>
@@ -1088,6 +1256,7 @@
           <w:szCs w:val="24"/>
         </w:rPr>
       </w:pPr>
+      <w:proofErr w:type="spellStart"/>
       <w:r>
         <w:rPr>
           <w:rFonts w:ascii="Times New Roman" w:hAnsi="Times New Roman" w:cs="Times New Roman"/>
@@ -1095,7 +1264,34 @@
           <w:szCs w:val="24"/>
         </w:rPr>
         <w:lastRenderedPageBreak/>
-        <w:t>Id_empleado (pk)</w:t>
+        <w:t>Id_empleado</w:t>
+      </w:r>
+      <w:proofErr w:type="spellEnd"/>
+      <w:r>
+        <w:rPr>
+          <w:rFonts w:ascii="Times New Roman" w:hAnsi="Times New Roman" w:cs="Times New Roman"/>
+          <w:sz w:val="24"/>
+          <w:szCs w:val="24"/>
+        </w:rPr>
+        <w:t xml:space="preserve"> (</w:t>
+      </w:r>
+      <w:proofErr w:type="spellStart"/>
+      <w:r>
+        <w:rPr>
+          <w:rFonts w:ascii="Times New Roman" w:hAnsi="Times New Roman" w:cs="Times New Roman"/>
+          <w:sz w:val="24"/>
+          <w:szCs w:val="24"/>
+        </w:rPr>
+        <w:t>pk</w:t>
+      </w:r>
+      <w:proofErr w:type="spellEnd"/>
+      <w:r>
+        <w:rPr>
+          <w:rFonts w:ascii="Times New Roman" w:hAnsi="Times New Roman" w:cs="Times New Roman"/>
+          <w:sz w:val="24"/>
+          <w:szCs w:val="24"/>
+        </w:rPr>
+        <w:t>)</w:t>
       </w:r>
     </w:p>
     <w:p>
@@ -1224,13 +1420,41 @@
           <w:szCs w:val="24"/>
         </w:rPr>
       </w:pPr>
-      <w:r>
-        <w:rPr>
-          <w:rFonts w:ascii="Times New Roman" w:hAnsi="Times New Roman" w:cs="Times New Roman"/>
-          <w:sz w:val="24"/>
-          <w:szCs w:val="24"/>
-        </w:rPr>
-        <w:t>Id_venta (pk)</w:t>
+      <w:proofErr w:type="spellStart"/>
+      <w:r>
+        <w:rPr>
+          <w:rFonts w:ascii="Times New Roman" w:hAnsi="Times New Roman" w:cs="Times New Roman"/>
+          <w:sz w:val="24"/>
+          <w:szCs w:val="24"/>
+        </w:rPr>
+        <w:t>Id_venta</w:t>
+      </w:r>
+      <w:proofErr w:type="spellEnd"/>
+      <w:r>
+        <w:rPr>
+          <w:rFonts w:ascii="Times New Roman" w:hAnsi="Times New Roman" w:cs="Times New Roman"/>
+          <w:sz w:val="24"/>
+          <w:szCs w:val="24"/>
+        </w:rPr>
+        <w:t xml:space="preserve"> (</w:t>
+      </w:r>
+      <w:proofErr w:type="spellStart"/>
+      <w:r>
+        <w:rPr>
+          <w:rFonts w:ascii="Times New Roman" w:hAnsi="Times New Roman" w:cs="Times New Roman"/>
+          <w:sz w:val="24"/>
+          <w:szCs w:val="24"/>
+        </w:rPr>
+        <w:t>pk</w:t>
+      </w:r>
+      <w:proofErr w:type="spellEnd"/>
+      <w:r>
+        <w:rPr>
+          <w:rFonts w:ascii="Times New Roman" w:hAnsi="Times New Roman" w:cs="Times New Roman"/>
+          <w:sz w:val="24"/>
+          <w:szCs w:val="24"/>
+        </w:rPr>
+        <w:t>)</w:t>
       </w:r>
     </w:p>
     <w:p>
@@ -1270,13 +1494,41 @@
           <w:szCs w:val="24"/>
         </w:rPr>
       </w:pPr>
-      <w:r>
-        <w:rPr>
-          <w:rFonts w:ascii="Times New Roman" w:hAnsi="Times New Roman" w:cs="Times New Roman"/>
-          <w:sz w:val="24"/>
-          <w:szCs w:val="24"/>
-        </w:rPr>
-        <w:t>Id_cliente (fk)</w:t>
+      <w:proofErr w:type="spellStart"/>
+      <w:r>
+        <w:rPr>
+          <w:rFonts w:ascii="Times New Roman" w:hAnsi="Times New Roman" w:cs="Times New Roman"/>
+          <w:sz w:val="24"/>
+          <w:szCs w:val="24"/>
+        </w:rPr>
+        <w:t>Id_cliente</w:t>
+      </w:r>
+      <w:proofErr w:type="spellEnd"/>
+      <w:r>
+        <w:rPr>
+          <w:rFonts w:ascii="Times New Roman" w:hAnsi="Times New Roman" w:cs="Times New Roman"/>
+          <w:sz w:val="24"/>
+          <w:szCs w:val="24"/>
+        </w:rPr>
+        <w:t xml:space="preserve"> (</w:t>
+      </w:r>
+      <w:proofErr w:type="spellStart"/>
+      <w:r>
+        <w:rPr>
+          <w:rFonts w:ascii="Times New Roman" w:hAnsi="Times New Roman" w:cs="Times New Roman"/>
+          <w:sz w:val="24"/>
+          <w:szCs w:val="24"/>
+        </w:rPr>
+        <w:t>fk</w:t>
+      </w:r>
+      <w:proofErr w:type="spellEnd"/>
+      <w:r>
+        <w:rPr>
+          <w:rFonts w:ascii="Times New Roman" w:hAnsi="Times New Roman" w:cs="Times New Roman"/>
+          <w:sz w:val="24"/>
+          <w:szCs w:val="24"/>
+        </w:rPr>
+        <w:t>)</w:t>
       </w:r>
     </w:p>
     <w:p>
@@ -1317,6 +1569,7 @@
           <w:szCs w:val="24"/>
         </w:rPr>
       </w:pPr>
+      <w:proofErr w:type="spellStart"/>
       <w:r>
         <w:rPr>
           <w:rFonts w:ascii="Times New Roman" w:hAnsi="Times New Roman" w:cs="Times New Roman"/>
@@ -1327,6 +1580,7 @@
         </w:rPr>
         <w:t>DetalleVenta</w:t>
       </w:r>
+      <w:proofErr w:type="spellEnd"/>
     </w:p>
     <w:p>
       <w:pPr>
@@ -1382,13 +1636,41 @@
           <w:szCs w:val="24"/>
         </w:rPr>
       </w:pPr>
-      <w:r>
-        <w:rPr>
-          <w:rFonts w:ascii="Times New Roman" w:hAnsi="Times New Roman" w:cs="Times New Roman"/>
-          <w:sz w:val="24"/>
-          <w:szCs w:val="24"/>
-        </w:rPr>
-        <w:t>Id_detalle (pk)</w:t>
+      <w:proofErr w:type="spellStart"/>
+      <w:r>
+        <w:rPr>
+          <w:rFonts w:ascii="Times New Roman" w:hAnsi="Times New Roman" w:cs="Times New Roman"/>
+          <w:sz w:val="24"/>
+          <w:szCs w:val="24"/>
+        </w:rPr>
+        <w:t>Id_detalle</w:t>
+      </w:r>
+      <w:proofErr w:type="spellEnd"/>
+      <w:r>
+        <w:rPr>
+          <w:rFonts w:ascii="Times New Roman" w:hAnsi="Times New Roman" w:cs="Times New Roman"/>
+          <w:sz w:val="24"/>
+          <w:szCs w:val="24"/>
+        </w:rPr>
+        <w:t xml:space="preserve"> (</w:t>
+      </w:r>
+      <w:proofErr w:type="spellStart"/>
+      <w:r>
+        <w:rPr>
+          <w:rFonts w:ascii="Times New Roman" w:hAnsi="Times New Roman" w:cs="Times New Roman"/>
+          <w:sz w:val="24"/>
+          <w:szCs w:val="24"/>
+        </w:rPr>
+        <w:t>pk</w:t>
+      </w:r>
+      <w:proofErr w:type="spellEnd"/>
+      <w:r>
+        <w:rPr>
+          <w:rFonts w:ascii="Times New Roman" w:hAnsi="Times New Roman" w:cs="Times New Roman"/>
+          <w:sz w:val="24"/>
+          <w:szCs w:val="24"/>
+        </w:rPr>
+        <w:t>)</w:t>
       </w:r>
     </w:p>
     <w:p>
@@ -1405,13 +1687,41 @@
           <w:szCs w:val="24"/>
         </w:rPr>
       </w:pPr>
-      <w:r>
-        <w:rPr>
-          <w:rFonts w:ascii="Times New Roman" w:hAnsi="Times New Roman" w:cs="Times New Roman"/>
-          <w:sz w:val="24"/>
-          <w:szCs w:val="24"/>
-        </w:rPr>
-        <w:t>Id_venta (fk)</w:t>
+      <w:proofErr w:type="spellStart"/>
+      <w:r>
+        <w:rPr>
+          <w:rFonts w:ascii="Times New Roman" w:hAnsi="Times New Roman" w:cs="Times New Roman"/>
+          <w:sz w:val="24"/>
+          <w:szCs w:val="24"/>
+        </w:rPr>
+        <w:t>Id_venta</w:t>
+      </w:r>
+      <w:proofErr w:type="spellEnd"/>
+      <w:r>
+        <w:rPr>
+          <w:rFonts w:ascii="Times New Roman" w:hAnsi="Times New Roman" w:cs="Times New Roman"/>
+          <w:sz w:val="24"/>
+          <w:szCs w:val="24"/>
+        </w:rPr>
+        <w:t xml:space="preserve"> (</w:t>
+      </w:r>
+      <w:proofErr w:type="spellStart"/>
+      <w:r>
+        <w:rPr>
+          <w:rFonts w:ascii="Times New Roman" w:hAnsi="Times New Roman" w:cs="Times New Roman"/>
+          <w:sz w:val="24"/>
+          <w:szCs w:val="24"/>
+        </w:rPr>
+        <w:t>fk</w:t>
+      </w:r>
+      <w:proofErr w:type="spellEnd"/>
+      <w:r>
+        <w:rPr>
+          <w:rFonts w:ascii="Times New Roman" w:hAnsi="Times New Roman" w:cs="Times New Roman"/>
+          <w:sz w:val="24"/>
+          <w:szCs w:val="24"/>
+        </w:rPr>
+        <w:t>)</w:t>
       </w:r>
     </w:p>
     <w:p>
@@ -1428,13 +1738,41 @@
           <w:szCs w:val="24"/>
         </w:rPr>
       </w:pPr>
-      <w:r>
-        <w:rPr>
-          <w:rFonts w:ascii="Times New Roman" w:hAnsi="Times New Roman" w:cs="Times New Roman"/>
-          <w:sz w:val="24"/>
-          <w:szCs w:val="24"/>
-        </w:rPr>
-        <w:t>Id_producto (fk)</w:t>
+      <w:proofErr w:type="spellStart"/>
+      <w:r>
+        <w:rPr>
+          <w:rFonts w:ascii="Times New Roman" w:hAnsi="Times New Roman" w:cs="Times New Roman"/>
+          <w:sz w:val="24"/>
+          <w:szCs w:val="24"/>
+        </w:rPr>
+        <w:t>Id_producto</w:t>
+      </w:r>
+      <w:proofErr w:type="spellEnd"/>
+      <w:r>
+        <w:rPr>
+          <w:rFonts w:ascii="Times New Roman" w:hAnsi="Times New Roman" w:cs="Times New Roman"/>
+          <w:sz w:val="24"/>
+          <w:szCs w:val="24"/>
+        </w:rPr>
+        <w:t xml:space="preserve"> (</w:t>
+      </w:r>
+      <w:proofErr w:type="spellStart"/>
+      <w:r>
+        <w:rPr>
+          <w:rFonts w:ascii="Times New Roman" w:hAnsi="Times New Roman" w:cs="Times New Roman"/>
+          <w:sz w:val="24"/>
+          <w:szCs w:val="24"/>
+        </w:rPr>
+        <w:t>fk</w:t>
+      </w:r>
+      <w:proofErr w:type="spellEnd"/>
+      <w:r>
+        <w:rPr>
+          <w:rFonts w:ascii="Times New Roman" w:hAnsi="Times New Roman" w:cs="Times New Roman"/>
+          <w:sz w:val="24"/>
+          <w:szCs w:val="24"/>
+        </w:rPr>
+        <w:t>)</w:t>
       </w:r>
     </w:p>
     <w:p>
@@ -1474,6 +1812,7 @@
           <w:szCs w:val="24"/>
         </w:rPr>
       </w:pPr>
+      <w:proofErr w:type="spellStart"/>
       <w:r>
         <w:rPr>
           <w:rFonts w:ascii="Times New Roman" w:hAnsi="Times New Roman" w:cs="Times New Roman"/>
@@ -1482,6 +1821,7 @@
         </w:rPr>
         <w:t>Precio_unitario</w:t>
       </w:r>
+      <w:proofErr w:type="spellEnd"/>
     </w:p>
     <w:p>
       <w:pPr>
@@ -1650,6 +1990,7 @@
           <w:rFonts w:ascii="Times New Roman" w:hAnsi="Times New Roman" w:cs="Times New Roman"/>
           <w:b/>
           <w:bCs/>
+          <w:noProof/>
           <w:sz w:val="28"/>
           <w:szCs w:val="28"/>
         </w:rPr>
@@ -1788,7 +2129,25 @@
           <w:sz w:val="24"/>
           <w:szCs w:val="24"/>
         </w:rPr>
-        <w:t xml:space="preserve"> id_venta,</w:t>
+        <w:t xml:space="preserve"> </w:t>
+      </w:r>
+      <w:proofErr w:type="spellStart"/>
+      <w:r>
+        <w:rPr>
+          <w:rFonts w:ascii="Times New Roman" w:hAnsi="Times New Roman" w:cs="Times New Roman"/>
+          <w:sz w:val="24"/>
+          <w:szCs w:val="24"/>
+        </w:rPr>
+        <w:t>id_venta</w:t>
+      </w:r>
+      <w:proofErr w:type="spellEnd"/>
+      <w:r>
+        <w:rPr>
+          <w:rFonts w:ascii="Times New Roman" w:hAnsi="Times New Roman" w:cs="Times New Roman"/>
+          <w:sz w:val="24"/>
+          <w:szCs w:val="24"/>
+        </w:rPr>
+        <w:t>,</w:t>
       </w:r>
     </w:p>
     <w:p>
@@ -1824,97 +2183,205 @@
           <w:sz w:val="24"/>
           <w:szCs w:val="24"/>
         </w:rPr>
-        <w:t xml:space="preserve"> cliente_nombre,</w:t>
-      </w:r>
-    </w:p>
-    <w:p>
-      <w:pPr>
-        <w:pStyle w:val="Prrafodelista"/>
-        <w:rPr>
-          <w:rFonts w:ascii="Times New Roman" w:hAnsi="Times New Roman" w:cs="Times New Roman"/>
-          <w:sz w:val="24"/>
-          <w:szCs w:val="24"/>
-        </w:rPr>
-      </w:pPr>
-      <w:r>
-        <w:rPr>
-          <w:rFonts w:ascii="Times New Roman" w:hAnsi="Times New Roman" w:cs="Times New Roman"/>
-          <w:sz w:val="24"/>
-          <w:szCs w:val="24"/>
-        </w:rPr>
-        <w:t xml:space="preserve"> cliente_email,</w:t>
-      </w:r>
-    </w:p>
-    <w:p>
-      <w:pPr>
-        <w:pStyle w:val="Prrafodelista"/>
-        <w:rPr>
-          <w:rFonts w:ascii="Times New Roman" w:hAnsi="Times New Roman" w:cs="Times New Roman"/>
-          <w:sz w:val="24"/>
-          <w:szCs w:val="24"/>
-        </w:rPr>
-      </w:pPr>
-      <w:r>
-        <w:rPr>
-          <w:rFonts w:ascii="Times New Roman" w:hAnsi="Times New Roman" w:cs="Times New Roman"/>
-          <w:sz w:val="24"/>
-          <w:szCs w:val="24"/>
-        </w:rPr>
-        <w:t xml:space="preserve"> empleado_nombre,</w:t>
-      </w:r>
-    </w:p>
-    <w:p>
-      <w:pPr>
-        <w:pStyle w:val="Prrafodelista"/>
-        <w:rPr>
-          <w:rFonts w:ascii="Times New Roman" w:hAnsi="Times New Roman" w:cs="Times New Roman"/>
-          <w:sz w:val="24"/>
-          <w:szCs w:val="24"/>
-        </w:rPr>
-      </w:pPr>
-      <w:r>
-        <w:rPr>
-          <w:rFonts w:ascii="Times New Roman" w:hAnsi="Times New Roman" w:cs="Times New Roman"/>
-          <w:sz w:val="24"/>
-          <w:szCs w:val="24"/>
-        </w:rPr>
-        <w:t xml:space="preserve"> producto_nombre,</w:t>
-      </w:r>
-    </w:p>
-    <w:p>
-      <w:pPr>
-        <w:pStyle w:val="Prrafodelista"/>
-        <w:rPr>
-          <w:rFonts w:ascii="Times New Roman" w:hAnsi="Times New Roman" w:cs="Times New Roman"/>
-          <w:sz w:val="24"/>
-          <w:szCs w:val="24"/>
-        </w:rPr>
-      </w:pPr>
-      <w:r>
-        <w:rPr>
-          <w:rFonts w:ascii="Times New Roman" w:hAnsi="Times New Roman" w:cs="Times New Roman"/>
-          <w:sz w:val="24"/>
-          <w:szCs w:val="24"/>
-        </w:rPr>
-        <w:t xml:space="preserve"> categoria_nombre,</w:t>
-      </w:r>
-    </w:p>
-    <w:p>
-      <w:pPr>
-        <w:pStyle w:val="Prrafodelista"/>
-        <w:rPr>
-          <w:rFonts w:ascii="Times New Roman" w:hAnsi="Times New Roman" w:cs="Times New Roman"/>
-          <w:sz w:val="24"/>
-          <w:szCs w:val="24"/>
-        </w:rPr>
-      </w:pPr>
-      <w:r>
-        <w:rPr>
-          <w:rFonts w:ascii="Times New Roman" w:hAnsi="Times New Roman" w:cs="Times New Roman"/>
-          <w:sz w:val="24"/>
-          <w:szCs w:val="24"/>
-        </w:rPr>
-        <w:t xml:space="preserve"> proveedor_nombre,</w:t>
+        <w:t xml:space="preserve"> </w:t>
+      </w:r>
+      <w:proofErr w:type="spellStart"/>
+      <w:r>
+        <w:rPr>
+          <w:rFonts w:ascii="Times New Roman" w:hAnsi="Times New Roman" w:cs="Times New Roman"/>
+          <w:sz w:val="24"/>
+          <w:szCs w:val="24"/>
+        </w:rPr>
+        <w:t>cliente_nombre</w:t>
+      </w:r>
+      <w:proofErr w:type="spellEnd"/>
+      <w:r>
+        <w:rPr>
+          <w:rFonts w:ascii="Times New Roman" w:hAnsi="Times New Roman" w:cs="Times New Roman"/>
+          <w:sz w:val="24"/>
+          <w:szCs w:val="24"/>
+        </w:rPr>
+        <w:t>,</w:t>
+      </w:r>
+    </w:p>
+    <w:p>
+      <w:pPr>
+        <w:pStyle w:val="Prrafodelista"/>
+        <w:rPr>
+          <w:rFonts w:ascii="Times New Roman" w:hAnsi="Times New Roman" w:cs="Times New Roman"/>
+          <w:sz w:val="24"/>
+          <w:szCs w:val="24"/>
+        </w:rPr>
+      </w:pPr>
+      <w:r>
+        <w:rPr>
+          <w:rFonts w:ascii="Times New Roman" w:hAnsi="Times New Roman" w:cs="Times New Roman"/>
+          <w:sz w:val="24"/>
+          <w:szCs w:val="24"/>
+        </w:rPr>
+        <w:t xml:space="preserve"> </w:t>
+      </w:r>
+      <w:proofErr w:type="spellStart"/>
+      <w:r>
+        <w:rPr>
+          <w:rFonts w:ascii="Times New Roman" w:hAnsi="Times New Roman" w:cs="Times New Roman"/>
+          <w:sz w:val="24"/>
+          <w:szCs w:val="24"/>
+        </w:rPr>
+        <w:t>cliente_email</w:t>
+      </w:r>
+      <w:proofErr w:type="spellEnd"/>
+      <w:r>
+        <w:rPr>
+          <w:rFonts w:ascii="Times New Roman" w:hAnsi="Times New Roman" w:cs="Times New Roman"/>
+          <w:sz w:val="24"/>
+          <w:szCs w:val="24"/>
+        </w:rPr>
+        <w:t>,</w:t>
+      </w:r>
+    </w:p>
+    <w:p>
+      <w:pPr>
+        <w:pStyle w:val="Prrafodelista"/>
+        <w:rPr>
+          <w:rFonts w:ascii="Times New Roman" w:hAnsi="Times New Roman" w:cs="Times New Roman"/>
+          <w:sz w:val="24"/>
+          <w:szCs w:val="24"/>
+        </w:rPr>
+      </w:pPr>
+      <w:r>
+        <w:rPr>
+          <w:rFonts w:ascii="Times New Roman" w:hAnsi="Times New Roman" w:cs="Times New Roman"/>
+          <w:sz w:val="24"/>
+          <w:szCs w:val="24"/>
+        </w:rPr>
+        <w:t xml:space="preserve"> </w:t>
+      </w:r>
+      <w:proofErr w:type="spellStart"/>
+      <w:r>
+        <w:rPr>
+          <w:rFonts w:ascii="Times New Roman" w:hAnsi="Times New Roman" w:cs="Times New Roman"/>
+          <w:sz w:val="24"/>
+          <w:szCs w:val="24"/>
+        </w:rPr>
+        <w:t>empleado_nombre</w:t>
+      </w:r>
+      <w:proofErr w:type="spellEnd"/>
+      <w:r>
+        <w:rPr>
+          <w:rFonts w:ascii="Times New Roman" w:hAnsi="Times New Roman" w:cs="Times New Roman"/>
+          <w:sz w:val="24"/>
+          <w:szCs w:val="24"/>
+        </w:rPr>
+        <w:t>,</w:t>
+      </w:r>
+    </w:p>
+    <w:p>
+      <w:pPr>
+        <w:pStyle w:val="Prrafodelista"/>
+        <w:rPr>
+          <w:rFonts w:ascii="Times New Roman" w:hAnsi="Times New Roman" w:cs="Times New Roman"/>
+          <w:sz w:val="24"/>
+          <w:szCs w:val="24"/>
+        </w:rPr>
+      </w:pPr>
+      <w:r>
+        <w:rPr>
+          <w:rFonts w:ascii="Times New Roman" w:hAnsi="Times New Roman" w:cs="Times New Roman"/>
+          <w:sz w:val="24"/>
+          <w:szCs w:val="24"/>
+        </w:rPr>
+        <w:t xml:space="preserve"> </w:t>
+      </w:r>
+      <w:proofErr w:type="spellStart"/>
+      <w:r>
+        <w:rPr>
+          <w:rFonts w:ascii="Times New Roman" w:hAnsi="Times New Roman" w:cs="Times New Roman"/>
+          <w:sz w:val="24"/>
+          <w:szCs w:val="24"/>
+        </w:rPr>
+        <w:t>producto_nombre</w:t>
+      </w:r>
+      <w:proofErr w:type="spellEnd"/>
+      <w:r>
+        <w:rPr>
+          <w:rFonts w:ascii="Times New Roman" w:hAnsi="Times New Roman" w:cs="Times New Roman"/>
+          <w:sz w:val="24"/>
+          <w:szCs w:val="24"/>
+        </w:rPr>
+        <w:t>,</w:t>
+      </w:r>
+    </w:p>
+    <w:p>
+      <w:pPr>
+        <w:pStyle w:val="Prrafodelista"/>
+        <w:rPr>
+          <w:rFonts w:ascii="Times New Roman" w:hAnsi="Times New Roman" w:cs="Times New Roman"/>
+          <w:sz w:val="24"/>
+          <w:szCs w:val="24"/>
+        </w:rPr>
+      </w:pPr>
+      <w:r>
+        <w:rPr>
+          <w:rFonts w:ascii="Times New Roman" w:hAnsi="Times New Roman" w:cs="Times New Roman"/>
+          <w:sz w:val="24"/>
+          <w:szCs w:val="24"/>
+        </w:rPr>
+        <w:t xml:space="preserve"> </w:t>
+      </w:r>
+      <w:proofErr w:type="spellStart"/>
+      <w:r>
+        <w:rPr>
+          <w:rFonts w:ascii="Times New Roman" w:hAnsi="Times New Roman" w:cs="Times New Roman"/>
+          <w:sz w:val="24"/>
+          <w:szCs w:val="24"/>
+        </w:rPr>
+        <w:t>categoria_nombre</w:t>
+      </w:r>
+      <w:proofErr w:type="spellEnd"/>
+      <w:r>
+        <w:rPr>
+          <w:rFonts w:ascii="Times New Roman" w:hAnsi="Times New Roman" w:cs="Times New Roman"/>
+          <w:sz w:val="24"/>
+          <w:szCs w:val="24"/>
+        </w:rPr>
+        <w:t>,</w:t>
+      </w:r>
+    </w:p>
+    <w:p>
+      <w:pPr>
+        <w:pStyle w:val="Prrafodelista"/>
+        <w:rPr>
+          <w:rFonts w:ascii="Times New Roman" w:hAnsi="Times New Roman" w:cs="Times New Roman"/>
+          <w:sz w:val="24"/>
+          <w:szCs w:val="24"/>
+        </w:rPr>
+      </w:pPr>
+      <w:r>
+        <w:rPr>
+          <w:rFonts w:ascii="Times New Roman" w:hAnsi="Times New Roman" w:cs="Times New Roman"/>
+          <w:sz w:val="24"/>
+          <w:szCs w:val="24"/>
+        </w:rPr>
+        <w:t xml:space="preserve"> </w:t>
+      </w:r>
+      <w:proofErr w:type="spellStart"/>
+      <w:r>
+        <w:rPr>
+          <w:rFonts w:ascii="Times New Roman" w:hAnsi="Times New Roman" w:cs="Times New Roman"/>
+          <w:sz w:val="24"/>
+          <w:szCs w:val="24"/>
+        </w:rPr>
+        <w:t>proveedor_nombre</w:t>
+      </w:r>
+      <w:proofErr w:type="spellEnd"/>
+      <w:r>
+        <w:rPr>
+          <w:rFonts w:ascii="Times New Roman" w:hAnsi="Times New Roman" w:cs="Times New Roman"/>
+          <w:sz w:val="24"/>
+          <w:szCs w:val="24"/>
+        </w:rPr>
+        <w:t>,</w:t>
       </w:r>
     </w:p>
     <w:p>
@@ -1950,8 +2417,18 @@
           <w:sz w:val="24"/>
           <w:szCs w:val="24"/>
         </w:rPr>
-        <w:t xml:space="preserve"> precio_unitario</w:t>
-      </w:r>
+        <w:t xml:space="preserve"> </w:t>
+      </w:r>
+      <w:proofErr w:type="spellStart"/>
+      <w:r>
+        <w:rPr>
+          <w:rFonts w:ascii="Times New Roman" w:hAnsi="Times New Roman" w:cs="Times New Roman"/>
+          <w:sz w:val="24"/>
+          <w:szCs w:val="24"/>
+        </w:rPr>
+        <w:t>precio_unitario</w:t>
+      </w:r>
+      <w:proofErr w:type="spellEnd"/>
     </w:p>
     <w:p>
       <w:pPr>
@@ -2097,7 +2574,25 @@
           <w:sz w:val="24"/>
           <w:szCs w:val="24"/>
         </w:rPr>
-        <w:t>Se eliminaron grupos repetitivos separando los productos en la tabla Detalle_venta, garantizando atomicidad de los atributos.</w:t>
+        <w:t xml:space="preserve">Se eliminaron grupos repetitivos separando los productos en la tabla </w:t>
+      </w:r>
+      <w:proofErr w:type="spellStart"/>
+      <w:r>
+        <w:rPr>
+          <w:rFonts w:ascii="Times New Roman" w:hAnsi="Times New Roman" w:cs="Times New Roman"/>
+          <w:sz w:val="24"/>
+          <w:szCs w:val="24"/>
+        </w:rPr>
+        <w:t>Detalle_venta</w:t>
+      </w:r>
+      <w:proofErr w:type="spellEnd"/>
+      <w:r>
+        <w:rPr>
+          <w:rFonts w:ascii="Times New Roman" w:hAnsi="Times New Roman" w:cs="Times New Roman"/>
+          <w:sz w:val="24"/>
+          <w:szCs w:val="24"/>
+        </w:rPr>
+        <w:t>, garantizando atomicidad de los atributos.</w:t>
       </w:r>
     </w:p>
     <w:p>
@@ -2225,8 +2720,36 @@
           <w:sz w:val="24"/>
           <w:szCs w:val="24"/>
         </w:rPr>
-        <w:t>Aquí se creo Detalle_venta</w:t>
-      </w:r>
+        <w:t xml:space="preserve">Aquí se </w:t>
+      </w:r>
+      <w:proofErr w:type="spellStart"/>
+      <w:r>
+        <w:rPr>
+          <w:rFonts w:ascii="Times New Roman" w:hAnsi="Times New Roman" w:cs="Times New Roman"/>
+          <w:sz w:val="24"/>
+          <w:szCs w:val="24"/>
+        </w:rPr>
+        <w:t>creo</w:t>
+      </w:r>
+      <w:proofErr w:type="spellEnd"/>
+      <w:r>
+        <w:rPr>
+          <w:rFonts w:ascii="Times New Roman" w:hAnsi="Times New Roman" w:cs="Times New Roman"/>
+          <w:sz w:val="24"/>
+          <w:szCs w:val="24"/>
+        </w:rPr>
+        <w:t xml:space="preserve"> </w:t>
+      </w:r>
+      <w:proofErr w:type="spellStart"/>
+      <w:r>
+        <w:rPr>
+          <w:rFonts w:ascii="Times New Roman" w:hAnsi="Times New Roman" w:cs="Times New Roman"/>
+          <w:sz w:val="24"/>
+          <w:szCs w:val="24"/>
+        </w:rPr>
+        <w:t>Detalle_venta</w:t>
+      </w:r>
+      <w:proofErr w:type="spellEnd"/>
     </w:p>
     <w:p>
       <w:pPr>
@@ -2353,7 +2876,61 @@
           <w:sz w:val="24"/>
           <w:szCs w:val="24"/>
         </w:rPr>
-        <w:t xml:space="preserve">Solo tenemos PK compuesta en Detalle_venta: (id_venta, id_producto) </w:t>
+        <w:t xml:space="preserve">Solo tenemos PK compuesta en </w:t>
+      </w:r>
+      <w:proofErr w:type="spellStart"/>
+      <w:r>
+        <w:rPr>
+          <w:rFonts w:ascii="Times New Roman" w:hAnsi="Times New Roman" w:cs="Times New Roman"/>
+          <w:sz w:val="24"/>
+          <w:szCs w:val="24"/>
+        </w:rPr>
+        <w:t>Detalle_venta</w:t>
+      </w:r>
+      <w:proofErr w:type="spellEnd"/>
+      <w:r>
+        <w:rPr>
+          <w:rFonts w:ascii="Times New Roman" w:hAnsi="Times New Roman" w:cs="Times New Roman"/>
+          <w:sz w:val="24"/>
+          <w:szCs w:val="24"/>
+        </w:rPr>
+        <w:t>: (</w:t>
+      </w:r>
+      <w:proofErr w:type="spellStart"/>
+      <w:r>
+        <w:rPr>
+          <w:rFonts w:ascii="Times New Roman" w:hAnsi="Times New Roman" w:cs="Times New Roman"/>
+          <w:sz w:val="24"/>
+          <w:szCs w:val="24"/>
+        </w:rPr>
+        <w:t>id_venta</w:t>
+      </w:r>
+      <w:proofErr w:type="spellEnd"/>
+      <w:r>
+        <w:rPr>
+          <w:rFonts w:ascii="Times New Roman" w:hAnsi="Times New Roman" w:cs="Times New Roman"/>
+          <w:sz w:val="24"/>
+          <w:szCs w:val="24"/>
+        </w:rPr>
+        <w:t xml:space="preserve">, </w:t>
+      </w:r>
+      <w:proofErr w:type="spellStart"/>
+      <w:r>
+        <w:rPr>
+          <w:rFonts w:ascii="Times New Roman" w:hAnsi="Times New Roman" w:cs="Times New Roman"/>
+          <w:sz w:val="24"/>
+          <w:szCs w:val="24"/>
+        </w:rPr>
+        <w:t>id_producto</w:t>
+      </w:r>
+      <w:proofErr w:type="spellEnd"/>
+      <w:r>
+        <w:rPr>
+          <w:rFonts w:ascii="Times New Roman" w:hAnsi="Times New Roman" w:cs="Times New Roman"/>
+          <w:sz w:val="24"/>
+          <w:szCs w:val="24"/>
+        </w:rPr>
+        <w:t xml:space="preserve">) </w:t>
       </w:r>
       <w:r>
         <w:rPr>
@@ -2369,8 +2946,18 @@
           <w:sz w:val="24"/>
           <w:szCs w:val="24"/>
         </w:rPr>
-        <w:t xml:space="preserve"> cantidad, precio_unitario</w:t>
-      </w:r>
+        <w:t xml:space="preserve"> cantidad, </w:t>
+      </w:r>
+      <w:proofErr w:type="spellStart"/>
+      <w:r>
+        <w:rPr>
+          <w:rFonts w:ascii="Times New Roman" w:hAnsi="Times New Roman" w:cs="Times New Roman"/>
+          <w:sz w:val="24"/>
+          <w:szCs w:val="24"/>
+        </w:rPr>
+        <w:t>precio_unitario</w:t>
+      </w:r>
+      <w:proofErr w:type="spellEnd"/>
     </w:p>
     <w:p>
       <w:pPr>
@@ -2407,13 +2994,23 @@
           <w:szCs w:val="24"/>
         </w:rPr>
       </w:pPr>
-      <w:r>
-        <w:rPr>
-          <w:rFonts w:ascii="Times New Roman" w:hAnsi="Times New Roman" w:cs="Times New Roman"/>
-          <w:sz w:val="24"/>
-          <w:szCs w:val="24"/>
-        </w:rPr>
-        <w:t>Precio_unitario depende de ambos</w:t>
+      <w:proofErr w:type="spellStart"/>
+      <w:r>
+        <w:rPr>
+          <w:rFonts w:ascii="Times New Roman" w:hAnsi="Times New Roman" w:cs="Times New Roman"/>
+          <w:sz w:val="24"/>
+          <w:szCs w:val="24"/>
+        </w:rPr>
+        <w:t>Precio_unitario</w:t>
+      </w:r>
+      <w:proofErr w:type="spellEnd"/>
+      <w:r>
+        <w:rPr>
+          <w:rFonts w:ascii="Times New Roman" w:hAnsi="Times New Roman" w:cs="Times New Roman"/>
+          <w:sz w:val="24"/>
+          <w:szCs w:val="24"/>
+        </w:rPr>
+        <w:t xml:space="preserve"> depende de ambos</w:t>
       </w:r>
     </w:p>
     <w:p>
@@ -2479,7 +3076,25 @@
           <w:sz w:val="24"/>
           <w:szCs w:val="24"/>
         </w:rPr>
-        <w:t>Se eliminaron dependencias transitivas creando tablas como Categoria y Proveedor, evitando redundancia de información.</w:t>
+        <w:t xml:space="preserve">Se eliminaron dependencias transitivas creando tablas como </w:t>
+      </w:r>
+      <w:proofErr w:type="spellStart"/>
+      <w:r>
+        <w:rPr>
+          <w:rFonts w:ascii="Times New Roman" w:hAnsi="Times New Roman" w:cs="Times New Roman"/>
+          <w:sz w:val="24"/>
+          <w:szCs w:val="24"/>
+        </w:rPr>
+        <w:t>Categoria</w:t>
+      </w:r>
+      <w:proofErr w:type="spellEnd"/>
+      <w:r>
+        <w:rPr>
+          <w:rFonts w:ascii="Times New Roman" w:hAnsi="Times New Roman" w:cs="Times New Roman"/>
+          <w:sz w:val="24"/>
+          <w:szCs w:val="24"/>
+        </w:rPr>
+        <w:t xml:space="preserve"> y Proveedor, evitando redundancia de información.</w:t>
       </w:r>
     </w:p>
     <w:p>
@@ -2541,7 +3156,25 @@
           <w:sz w:val="24"/>
           <w:szCs w:val="24"/>
         </w:rPr>
-        <w:t xml:space="preserve">En Producto id_producto </w:t>
+        <w:t xml:space="preserve">En Producto </w:t>
+      </w:r>
+      <w:proofErr w:type="spellStart"/>
+      <w:r>
+        <w:rPr>
+          <w:rFonts w:ascii="Times New Roman" w:hAnsi="Times New Roman" w:cs="Times New Roman"/>
+          <w:sz w:val="24"/>
+          <w:szCs w:val="24"/>
+        </w:rPr>
+        <w:t>id_producto</w:t>
+      </w:r>
+      <w:proofErr w:type="spellEnd"/>
+      <w:r>
+        <w:rPr>
+          <w:rFonts w:ascii="Times New Roman" w:hAnsi="Times New Roman" w:cs="Times New Roman"/>
+          <w:sz w:val="24"/>
+          <w:szCs w:val="24"/>
+        </w:rPr>
+        <w:t xml:space="preserve"> </w:t>
       </w:r>
       <w:r>
         <w:rPr>
@@ -2557,7 +3190,25 @@
           <w:sz w:val="24"/>
           <w:szCs w:val="24"/>
         </w:rPr>
-        <w:t xml:space="preserve"> id_categoria </w:t>
+        <w:t xml:space="preserve"> </w:t>
+      </w:r>
+      <w:proofErr w:type="spellStart"/>
+      <w:r>
+        <w:rPr>
+          <w:rFonts w:ascii="Times New Roman" w:hAnsi="Times New Roman" w:cs="Times New Roman"/>
+          <w:sz w:val="24"/>
+          <w:szCs w:val="24"/>
+        </w:rPr>
+        <w:t>id_categoria</w:t>
+      </w:r>
+      <w:proofErr w:type="spellEnd"/>
+      <w:r>
+        <w:rPr>
+          <w:rFonts w:ascii="Times New Roman" w:hAnsi="Times New Roman" w:cs="Times New Roman"/>
+          <w:sz w:val="24"/>
+          <w:szCs w:val="24"/>
+        </w:rPr>
+        <w:t xml:space="preserve"> </w:t>
       </w:r>
       <w:r>
         <w:rPr>
@@ -2573,8 +3224,18 @@
           <w:sz w:val="24"/>
           <w:szCs w:val="24"/>
         </w:rPr>
-        <w:t xml:space="preserve"> nombre_categoria</w:t>
-      </w:r>
+        <w:t xml:space="preserve"> </w:t>
+      </w:r>
+      <w:proofErr w:type="spellStart"/>
+      <w:r>
+        <w:rPr>
+          <w:rFonts w:ascii="Times New Roman" w:hAnsi="Times New Roman" w:cs="Times New Roman"/>
+          <w:sz w:val="24"/>
+          <w:szCs w:val="24"/>
+        </w:rPr>
+        <w:t>nombre_categoria</w:t>
+      </w:r>
+      <w:proofErr w:type="spellEnd"/>
     </w:p>
     <w:p>
       <w:pPr>
@@ -2617,7 +3278,25 @@
           <w:sz w:val="24"/>
           <w:szCs w:val="24"/>
         </w:rPr>
-        <w:t xml:space="preserve">En Producto id_producto </w:t>
+        <w:t xml:space="preserve">En Producto </w:t>
+      </w:r>
+      <w:proofErr w:type="spellStart"/>
+      <w:r>
+        <w:rPr>
+          <w:rFonts w:ascii="Times New Roman" w:hAnsi="Times New Roman" w:cs="Times New Roman"/>
+          <w:sz w:val="24"/>
+          <w:szCs w:val="24"/>
+        </w:rPr>
+        <w:t>id_producto</w:t>
+      </w:r>
+      <w:proofErr w:type="spellEnd"/>
+      <w:r>
+        <w:rPr>
+          <w:rFonts w:ascii="Times New Roman" w:hAnsi="Times New Roman" w:cs="Times New Roman"/>
+          <w:sz w:val="24"/>
+          <w:szCs w:val="24"/>
+        </w:rPr>
+        <w:t xml:space="preserve"> </w:t>
       </w:r>
       <w:r>
         <w:rPr>
@@ -2633,7 +3312,25 @@
           <w:sz w:val="24"/>
           <w:szCs w:val="24"/>
         </w:rPr>
-        <w:t xml:space="preserve"> id_proveedor </w:t>
+        <w:t xml:space="preserve"> </w:t>
+      </w:r>
+      <w:proofErr w:type="spellStart"/>
+      <w:r>
+        <w:rPr>
+          <w:rFonts w:ascii="Times New Roman" w:hAnsi="Times New Roman" w:cs="Times New Roman"/>
+          <w:sz w:val="24"/>
+          <w:szCs w:val="24"/>
+        </w:rPr>
+        <w:t>id_proveedor</w:t>
+      </w:r>
+      <w:proofErr w:type="spellEnd"/>
+      <w:r>
+        <w:rPr>
+          <w:rFonts w:ascii="Times New Roman" w:hAnsi="Times New Roman" w:cs="Times New Roman"/>
+          <w:sz w:val="24"/>
+          <w:szCs w:val="24"/>
+        </w:rPr>
+        <w:t xml:space="preserve"> </w:t>
       </w:r>
       <w:r>
         <w:rPr>
@@ -2649,8 +3346,18 @@
           <w:sz w:val="24"/>
           <w:szCs w:val="24"/>
         </w:rPr>
-        <w:t xml:space="preserve"> nombre_proveedor</w:t>
-      </w:r>
+        <w:t xml:space="preserve"> </w:t>
+      </w:r>
+      <w:proofErr w:type="spellStart"/>
+      <w:r>
+        <w:rPr>
+          <w:rFonts w:ascii="Times New Roman" w:hAnsi="Times New Roman" w:cs="Times New Roman"/>
+          <w:sz w:val="24"/>
+          <w:szCs w:val="24"/>
+        </w:rPr>
+        <w:t>nombre_proveedor</w:t>
+      </w:r>
+      <w:proofErr w:type="spellEnd"/>
     </w:p>
     <w:p>
       <w:pPr>
@@ -2694,6 +3401,52 @@
           <w:szCs w:val="24"/>
         </w:rPr>
         <w:t>Se cumple 3FN</w:t>
+      </w:r>
+    </w:p>
+    <w:p>
+      <w:pPr>
+        <w:rPr>
+          <w:rFonts w:ascii="Times New Roman" w:hAnsi="Times New Roman" w:cs="Times New Roman"/>
+          <w:sz w:val="24"/>
+          <w:szCs w:val="24"/>
+        </w:rPr>
+      </w:pPr>
+      <w:r>
+        <w:rPr>
+          <w:rFonts w:ascii="Times New Roman" w:hAnsi="Times New Roman" w:cs="Times New Roman"/>
+          <w:b/>
+          <w:bCs/>
+          <w:sz w:val="24"/>
+          <w:szCs w:val="24"/>
+        </w:rPr>
+        <w:t>Link de Repositorio en GitHub:</w:t>
+      </w:r>
+      <w:r>
+        <w:rPr>
+          <w:rFonts w:ascii="Times New Roman" w:hAnsi="Times New Roman" w:cs="Times New Roman"/>
+          <w:sz w:val="24"/>
+          <w:szCs w:val="24"/>
+        </w:rPr>
+        <w:t xml:space="preserve"> </w:t>
+      </w:r>
+      <w:hyperlink r:id="rId9" w:history="1">
+        <w:r>
+          <w:rPr>
+            <w:rStyle w:val="Hipervnculo"/>
+            <w:rFonts w:ascii="Times New Roman" w:hAnsi="Times New Roman" w:cs="Times New Roman"/>
+            <w:sz w:val="24"/>
+            <w:szCs w:val="24"/>
+          </w:rPr>
+          <w:t>https://github.com/JuanGualim/Proyecto_2_DB1</w:t>
+        </w:r>
+      </w:hyperlink>
+      <w:r>
+        <w:rPr>
+          <w:rFonts w:ascii="Times New Roman" w:hAnsi="Times New Roman" w:cs="Times New Roman"/>
+          <w:sz w:val="24"/>
+          <w:szCs w:val="24"/>
+        </w:rPr>
+        <w:t xml:space="preserve"> </w:t>
       </w:r>
     </w:p>
     <w:sectPr>

</xml_diff>